<commit_message>
Update V3 Ben's Exploratory Draft.docx
</commit_message>
<xml_diff>
--- a/drafts/V3 Ben's Exploratory Draft.docx
+++ b/drafts/V3 Ben's Exploratory Draft.docx
@@ -19,7 +19,7 @@
           <w:szCs w:val="38"/>
           <w:rtl w:val="0"/>
         </w:rPr>
-        <w:t xml:space="preserve">The Real Problem with the U.S. Retirement System </w:t>
+        <w:t xml:space="preserve">How to fix the U.S. Retirement System </w:t>
       </w:r>
     </w:p>
     <w:p>
@@ -44,6 +44,27 @@
           <w:rtl w:val="0"/>
         </w:rPr>
         <w:t xml:space="preserve">is a first step in the right direction </w:t>
+      </w:r>
+    </w:p>
+    <w:p>
+      <w:pPr>
+        <w:rPr/>
+      </w:pPr>
+      <w:r>
+        <w:rPr>
+          <w:rtl w:val="0"/>
+        </w:rPr>
+      </w:r>
+    </w:p>
+    <w:p>
+      <w:pPr>
+        <w:rPr/>
+      </w:pPr>
+      <w:r>
+        <w:rPr>
+          <w:rtl w:val="0"/>
+        </w:rPr>
+        <w:t xml:space="preserve">By Ben Glasner</w:t>
       </w:r>
     </w:p>
     <w:p>
@@ -288,21 +309,11 @@
         </w:rPr>
         <w:t xml:space="preserve"> by income, </w:t>
       </w:r>
-      <w:hyperlink r:id="rId9">
-        <w:r>
-          <w:rPr>
-            <w:color w:val="1155cc"/>
-            <w:u w:val="single"/>
-            <w:rtl w:val="0"/>
-          </w:rPr>
-          <w:t xml:space="preserve">four out of five of them</w:t>
-        </w:r>
-      </w:hyperlink>
-      <w:r>
-        <w:rPr>
-          <w:rtl w:val="0"/>
-        </w:rPr>
-        <w:t xml:space="preserve"> </w:t>
+      <w:r>
+        <w:rPr>
+          <w:rtl w:val="0"/>
+        </w:rPr>
+        <w:t xml:space="preserve">four out of five of them </w:t>
       </w:r>
       <w:r>
         <w:rPr>
@@ -355,7 +366,7 @@
         <w:ind w:left="720" w:hanging="360"/>
         <w:rPr/>
       </w:pPr>
-      <w:hyperlink r:id="rId10">
+      <w:hyperlink r:id="rId9">
         <w:r>
           <w:rPr>
             <w:color w:val="1155cc"/>
@@ -369,7 +380,7 @@
         <w:rPr>
           <w:rtl w:val="0"/>
         </w:rPr>
-        <w:t xml:space="preserve">, or roughly </w:t>
+        <w:t xml:space="preserve">, or about </w:t>
       </w:r>
       <w:r>
         <w:rPr>
@@ -416,7 +427,7 @@
         <w:rPr>
           <w:rtl w:val="0"/>
         </w:rPr>
-        <w:t xml:space="preserve">Among full-time private-sector workers, 42 percent lack access to any employer-sponsored plan. </w:t>
+        <w:t xml:space="preserve">Among full-time private-sector workers, 42 percent lack access to an employer-sponsored plan. The situation is even worse for part-time workers: 79 percent have no access to an employer-sponsored plan. </w:t>
       </w:r>
     </w:p>
     <w:p>
@@ -433,23 +444,6 @@
         <w:rPr>
           <w:rtl w:val="0"/>
         </w:rPr>
-        <w:t xml:space="preserve">Among part-time workers, the situation is worse still: 79 percent have no access to an employer-sponsored plan. </w:t>
-      </w:r>
-    </w:p>
-    <w:p>
-      <w:pPr>
-        <w:numPr>
-          <w:ilvl w:val="0"/>
-          <w:numId w:val="1"/>
-        </w:numPr>
-        <w:spacing w:after="200" w:before="0" w:lineRule="auto"/>
-        <w:ind w:left="720" w:hanging="360"/>
-        <w:rPr/>
-      </w:pPr>
-      <w:r>
-        <w:rPr>
-          <w:rtl w:val="0"/>
-        </w:rPr>
         <w:t xml:space="preserve">Nearly 80 percent of workers in the lowest earnings decile lack access, compared with just 18 percent in the highest decile.</w:t>
       </w:r>
     </w:p>
@@ -467,13 +461,13 @@
         <w:rPr>
           <w:rtl w:val="0"/>
         </w:rPr>
-        <w:t xml:space="preserve">The income disparity is accompanied by racial and ethnic, generational, and rural vs urban disparities. Only 39 percent of Black workers and 33 percent of Hispanic workers receive employer matching contributions. </w:t>
-      </w:r>
-      <w:r>
-        <w:rPr>
-          <w:rtl w:val="0"/>
-        </w:rPr>
-        <w:t xml:space="preserve">Young workers, workers in small firms, and those in rural communities</w:t>
+        <w:t xml:space="preserve">The income disparity is accompanied by racial and ethnic, generational, and rural vs urban disparities. Black workers, y</w:t>
+      </w:r>
+      <w:r>
+        <w:rPr>
+          <w:rtl w:val="0"/>
+        </w:rPr>
+        <w:t xml:space="preserve">oung workers, workers in small firms, and those in rural communities, for example,</w:t>
       </w:r>
       <w:r>
         <w:rPr>
@@ -481,7 +475,7 @@
         </w:rPr>
         <w:t xml:space="preserve"> are all </w:t>
       </w:r>
-      <w:hyperlink r:id="rId11">
+      <w:hyperlink r:id="rId10">
         <w:r>
           <w:rPr>
             <w:color w:val="1155cc"/>
@@ -518,7 +512,7 @@
                     <pic:cNvPicPr preferRelativeResize="0"/>
                   </pic:nvPicPr>
                   <pic:blipFill>
-                    <a:blip r:embed="rId12"/>
+                    <a:blip r:embed="rId11"/>
                     <a:srcRect b="0" l="0" r="0" t="0"/>
                     <a:stretch>
                       <a:fillRect/>
@@ -544,7 +538,7 @@
         </w:rPr>
         <w:t xml:space="preserve">For more on the methodology behind these estimates, including data on how many workers lack access to an employer match, see our earlier </w:t>
       </w:r>
-      <w:hyperlink r:id="rId13">
+      <w:hyperlink r:id="rId12">
         <w:r>
           <w:rPr>
             <w:color w:val="1155cc"/>
@@ -629,29 +623,29 @@
           <w:szCs w:val="24"/>
           <w:rtl w:val="0"/>
         </w:rPr>
-        <w:t xml:space="preserve">ut there has been significant confusion about what exactly has been announced, the likely effects of these new policies, and what policymakers should do next.</w:t>
-      </w:r>
-      <w:r>
-        <w:rPr>
-          <w:rtl w:val="0"/>
-        </w:rPr>
-      </w:r>
-    </w:p>
-    <w:p>
-      <w:pPr>
-        <w:spacing w:after="240" w:before="240" w:lineRule="auto"/>
-        <w:rPr>
-          <w:sz w:val="24"/>
-          <w:szCs w:val="24"/>
-        </w:rPr>
-      </w:pPr>
-      <w:r>
-        <w:rPr>
-          <w:sz w:val="24"/>
-          <w:szCs w:val="24"/>
-          <w:rtl w:val="0"/>
-        </w:rPr>
-        <w:t xml:space="preserve">Here we attempt to answer some of the most common questions we’ve received. </w:t>
+        <w:t xml:space="preserve">ut there is confusion about what exactly has been announced, the likely effects of these new policies, and what policymakers should do next.</w:t>
+      </w:r>
+      <w:r>
+        <w:rPr>
+          <w:rtl w:val="0"/>
+        </w:rPr>
+      </w:r>
+    </w:p>
+    <w:p>
+      <w:pPr>
+        <w:spacing w:after="240" w:before="240" w:lineRule="auto"/>
+        <w:rPr>
+          <w:sz w:val="24"/>
+          <w:szCs w:val="24"/>
+        </w:rPr>
+      </w:pPr>
+      <w:r>
+        <w:rPr>
+          <w:sz w:val="24"/>
+          <w:szCs w:val="24"/>
+          <w:rtl w:val="0"/>
+        </w:rPr>
+        <w:t xml:space="preserve">Here we attempt to answer some of the most common questions. </w:t>
       </w:r>
     </w:p>
     <w:p>
@@ -688,6 +682,14 @@
           <w:szCs w:val="24"/>
         </w:rPr>
       </w:pPr>
+      <w:r>
+        <w:rPr>
+          <w:sz w:val="24"/>
+          <w:szCs w:val="24"/>
+          <w:rtl w:val="0"/>
+        </w:rPr>
+        <w:t xml:space="preserve">On Thursday, April 23rd, the White House issued an </w:t>
+      </w:r>
       <w:commentRangeStart w:id="0"/>
       <w:r>
         <w:rPr>
@@ -695,7 +697,7 @@
           <w:szCs w:val="24"/>
           <w:rtl w:val="0"/>
         </w:rPr>
-        <w:t xml:space="preserve">I</w:t>
+        <w:t xml:space="preserve">executive order</w:t>
       </w:r>
       <w:commentRangeEnd w:id="0"/>
       <w:r>
@@ -707,44 +709,40 @@
           <w:szCs w:val="24"/>
           <w:rtl w:val="0"/>
         </w:rPr>
-        <w:t xml:space="preserve">n his State of the Union </w:t>
-      </w:r>
-      <w:hyperlink r:id="rId14">
-        <w:r>
-          <w:rPr>
-            <w:color w:val="1155cc"/>
-            <w:sz w:val="24"/>
-            <w:szCs w:val="24"/>
-            <w:u w:val="single"/>
-            <w:rtl w:val="0"/>
-          </w:rPr>
-          <w:t xml:space="preserve">address</w:t>
-        </w:r>
-      </w:hyperlink>
-      <w:r>
-        <w:rPr>
-          <w:sz w:val="24"/>
-          <w:szCs w:val="24"/>
-          <w:rtl w:val="0"/>
-        </w:rPr>
-        <w:t xml:space="preserve"> in February, President Trump announced a proposal to expand retirement plan access for private-sector workers without employer-sponsored coverage. </w:t>
-      </w:r>
-    </w:p>
-    <w:p>
-      <w:pPr>
-        <w:spacing w:after="240" w:before="240" w:lineRule="auto"/>
-        <w:rPr>
-          <w:sz w:val="24"/>
-          <w:szCs w:val="24"/>
-        </w:rPr>
-      </w:pPr>
-      <w:r>
-        <w:rPr>
-          <w:sz w:val="24"/>
-          <w:szCs w:val="24"/>
-          <w:rtl w:val="0"/>
-        </w:rPr>
-        <w:t xml:space="preserve">Specifically, the government would offer these workers a retirement plan similar to the Thrift Savings Plan, which is the retirement vehicle </w:t>
+        <w:t xml:space="preserve"> to expand retirement plan access for private-sector workers without employer-sponsored coverage.</w:t>
+      </w:r>
+    </w:p>
+    <w:p>
+      <w:pPr>
+        <w:spacing w:after="240" w:before="240" w:lineRule="auto"/>
+        <w:rPr>
+          <w:sz w:val="24"/>
+          <w:szCs w:val="24"/>
+        </w:rPr>
+      </w:pPr>
+      <w:r>
+        <w:rPr>
+          <w:sz w:val="24"/>
+          <w:szCs w:val="24"/>
+          <w:rtl w:val="0"/>
+        </w:rPr>
+        <w:t xml:space="preserve">Specifically, the </w:t>
+      </w:r>
+      <w:r>
+        <w:rPr>
+          <w:sz w:val="24"/>
+          <w:szCs w:val="24"/>
+          <w:rtl w:val="0"/>
+        </w:rPr>
+        <w:t xml:space="preserve">government is creating the infrastructure and parameters for financial institutions to offer</w:t>
+      </w:r>
+      <w:r>
+        <w:rPr>
+          <w:sz w:val="24"/>
+          <w:szCs w:val="24"/>
+          <w:rtl w:val="0"/>
+        </w:rPr>
+        <w:t xml:space="preserve"> these workers a retirement product similar to the Thrift Savings Plan, which is the retirement vehicle </w:t>
       </w:r>
       <w:r>
         <w:rPr>
@@ -777,24 +775,45 @@
           <w:szCs w:val="24"/>
           <w:rtl w:val="0"/>
         </w:rPr>
-        <w:t xml:space="preserve">The plan would be portable, meaning that workers who contribute to it would be able to take the plan with them from job to job. Workers who participate in the plan would be able to invest in passive, low-fee index funds that invest in equities and Treasuries. </w:t>
-      </w:r>
-    </w:p>
-    <w:p>
-      <w:pPr>
-        <w:spacing w:after="240" w:before="240" w:lineRule="auto"/>
-        <w:rPr>
-          <w:sz w:val="24"/>
-          <w:szCs w:val="24"/>
-        </w:rPr>
-      </w:pPr>
-      <w:r>
-        <w:rPr>
-          <w:sz w:val="24"/>
-          <w:szCs w:val="24"/>
-          <w:rtl w:val="0"/>
-        </w:rPr>
-        <w:t xml:space="preserve">In addition, the federal government would match half of each worker’s contributions to this plan up to a limit of $1,000 (or 50 percent of the first $2,000 contributed by a worker). </w:t>
+        <w:t xml:space="preserve">The new retirement plan will be portable, meaning that workers who contribute to it will be able to take the plan with them from job to job. Workers who participate in the plan will be </w:t>
+      </w:r>
+      <w:commentRangeStart w:id="1"/>
+      <w:r>
+        <w:rPr>
+          <w:sz w:val="24"/>
+          <w:szCs w:val="24"/>
+          <w:rtl w:val="0"/>
+        </w:rPr>
+        <w:t xml:space="preserve">able to invest in passive, low-fee index funds that invest in equities and Treasuries.</w:t>
+      </w:r>
+      <w:commentRangeEnd w:id="1"/>
+      <w:r>
+        <w:commentReference w:id="1"/>
+      </w:r>
+      <w:r>
+        <w:rPr>
+          <w:sz w:val="24"/>
+          <w:szCs w:val="24"/>
+          <w:rtl w:val="0"/>
+        </w:rPr>
+        <w:t xml:space="preserve"> </w:t>
+      </w:r>
+    </w:p>
+    <w:p>
+      <w:pPr>
+        <w:spacing w:after="240" w:before="240" w:lineRule="auto"/>
+        <w:rPr>
+          <w:sz w:val="24"/>
+          <w:szCs w:val="24"/>
+        </w:rPr>
+      </w:pPr>
+      <w:r>
+        <w:rPr>
+          <w:sz w:val="24"/>
+          <w:szCs w:val="24"/>
+          <w:rtl w:val="0"/>
+        </w:rPr>
+        <w:t xml:space="preserve">In addition, the federal government will match half of each worker’s contributions to this plan up to a limit of $1,000 (or 50 percent of the first $2,000 contributed by the worker). </w:t>
       </w:r>
     </w:p>
     <w:p>
@@ -834,7 +853,7 @@
         </w:rPr>
         <w:t xml:space="preserve">The first way is simply that more workers will have access to a tax-advantaged retirement plan. Retirement plans are incredibly </w:t>
       </w:r>
-      <w:hyperlink r:id="rId15">
+      <w:hyperlink r:id="rId13">
         <w:r>
           <w:rPr>
             <w:color w:val="1155cc"/>
@@ -888,7 +907,7 @@
           <w:szCs w:val="24"/>
           <w:rtl w:val="0"/>
         </w:rPr>
-        <w:t xml:space="preserve">The second way this plan would help workers is through the match, which will boost each worker’s annual retirement contribution.  </w:t>
+        <w:t xml:space="preserve">The second way this plan will help workers is through the match, which will boost each worker’s annual retirement contribution. </w:t>
       </w:r>
       <w:r>
         <w:rPr>
@@ -991,7 +1010,23 @@
           <w:szCs w:val="24"/>
           <w:rtl w:val="0"/>
         </w:rPr>
-        <w:t xml:space="preserve">The Trump administration is making it possible for eligible workers who currently lack an employer-sponsored retirement plan to also have access to the Saver’s Match through their new retirement account. Thus, according to the administration, the money for its new plan has already been appropriated under the Secure 2.0 Act, and no new legislation is needed. </w:t>
+        <w:t xml:space="preserve">The Trump administration is making it possible for eligible workers who currently lack an employer-sponsored retirement plan to also have access to the Saver’s Match through their new retirement account. Thus, according to the administration, </w:t>
+      </w:r>
+      <w:r>
+        <w:rPr>
+          <w:sz w:val="24"/>
+          <w:szCs w:val="24"/>
+          <w:rtl w:val="0"/>
+        </w:rPr>
+        <w:t xml:space="preserve">this matching benefit for its new plan has already been </w:t>
+      </w:r>
+      <w:r>
+        <w:rPr>
+          <w:sz w:val="24"/>
+          <w:szCs w:val="24"/>
+          <w:rtl w:val="0"/>
+        </w:rPr>
+        <w:t xml:space="preserve">passed by Congress under the Secure 2.0 Act, and no new legislation is needed. </w:t>
       </w:r>
     </w:p>
     <w:p>
@@ -1086,7 +1121,7 @@
           <w:szCs w:val="24"/>
           <w:rtl w:val="0"/>
         </w:rPr>
-        <w:t xml:space="preserve">The administration has indicated that the program would launch in 2027.</w:t>
+        <w:t xml:space="preserve">The program will launch in 2027.</w:t>
       </w:r>
       <w:r>
         <w:rPr>
@@ -1129,7 +1164,7 @@
           <w:szCs w:val="24"/>
           <w:rtl w:val="0"/>
         </w:rPr>
-        <w:t xml:space="preserve">Yes. But what we know about low-income workers is that they overwhelmingly tend not to because of the added administrative burden.</w:t>
+        <w:t xml:space="preserve">Yes. But what we know about low-income workers is that they overwhelmingly tend not to because of the administrative burden.</w:t>
       </w:r>
       <w:r>
         <w:rPr>
@@ -1145,7 +1180,7 @@
           <w:szCs w:val="24"/>
           <w:rtl w:val="0"/>
         </w:rPr>
-        <w:t xml:space="preserve"> Setting up such a plan on your own isn’t easy. The Trump administration is proposing to take on the administrative burden so that workers don’t have to. The plan would have the Treasury Department create accounts for workers who lack access to employer-sponsored plans. </w:t>
+        <w:t xml:space="preserve"> Setting up such a plan on your own isn’t easy. The Trump administration is proposing to take on the administrative burden so that workers don’t have to. The new accounts will be offered by private providers and overseen by the Treasury Department. </w:t>
       </w:r>
     </w:p>
     <w:p>
@@ -1166,7 +1201,7 @@
           <w:szCs w:val="24"/>
           <w:rtl w:val="0"/>
         </w:rPr>
-        <w:t xml:space="preserve">And workers would then be automatically enrolled in those accounts? </w:t>
+        <w:t xml:space="preserve">And workers will then be automatically enrolled in those accounts? </w:t>
       </w:r>
     </w:p>
     <w:p>
@@ -1228,7 +1263,7 @@
           <w:szCs w:val="24"/>
           <w:rtl w:val="0"/>
         </w:rPr>
-        <w:t xml:space="preserve">We’ll give you the topline numbers and then break down the numbers: </w:t>
+        <w:t xml:space="preserve">We’ll give you the topline numbers first: </w:t>
       </w:r>
     </w:p>
     <w:p>
@@ -1251,7 +1286,20 @@
           <w:szCs w:val="24"/>
           <w:rtl w:val="0"/>
         </w:rPr>
-        <w:t xml:space="preserve">54 million total workers will become eligible for a new retirement plan</w:t>
+        <w:t xml:space="preserve">54 million total workers will become eligible for a new retirement plan.</w:t>
+      </w:r>
+      <w:r>
+        <w:rPr>
+          <w:sz w:val="24"/>
+          <w:szCs w:val="24"/>
+          <w:vertAlign w:val="superscript"/>
+        </w:rPr>
+        <w:footnoteReference w:customMarkFollows="0" w:id="5"/>
+      </w:r>
+      <w:r>
+        <w:rPr>
+          <w:rtl w:val="0"/>
+        </w:rPr>
       </w:r>
     </w:p>
     <w:p>
@@ -1274,7 +1322,7 @@
           <w:szCs w:val="24"/>
           <w:rtl w:val="0"/>
         </w:rPr>
-        <w:t xml:space="preserve">Of those 54 million, 9.1 million will be eligible for the full Saver’s Match </w:t>
+        <w:t xml:space="preserve">Of those 54 million, 9.1 million will be eligible for the full Saver’s Match. </w:t>
       </w:r>
     </w:p>
     <w:p>
@@ -1297,41 +1345,58 @@
           <w:szCs w:val="24"/>
           <w:rtl w:val="0"/>
         </w:rPr>
-        <w:t xml:space="preserve">Of those 54 million, 13.3 million will be eligible for a partial Saver’s Match </w:t>
-      </w:r>
-    </w:p>
-    <w:p>
-      <w:pPr>
-        <w:spacing w:after="240" w:before="240" w:lineRule="auto"/>
-        <w:rPr>
-          <w:sz w:val="24"/>
-          <w:szCs w:val="24"/>
-        </w:rPr>
-      </w:pPr>
-      <w:r>
-        <w:rPr>
-          <w:sz w:val="24"/>
-          <w:szCs w:val="24"/>
-          <w:rtl w:val="0"/>
-        </w:rPr>
-        <w:t xml:space="preserve">Here’s how the math works. As already noted, roughly 54 million workers currently lack access to an employer-sponsored retirement plan. Conceivably, all of them would be eligible for the new retirement plans created by the Trump administration. </w:t>
-      </w:r>
-    </w:p>
-    <w:p>
-      <w:pPr>
-        <w:spacing w:after="240" w:before="240" w:lineRule="auto"/>
-        <w:rPr>
-          <w:sz w:val="24"/>
-          <w:szCs w:val="24"/>
-        </w:rPr>
-      </w:pPr>
-      <w:r>
-        <w:rPr>
-          <w:sz w:val="24"/>
-          <w:szCs w:val="24"/>
-          <w:rtl w:val="0"/>
-        </w:rPr>
-        <w:t xml:space="preserve">Not all of them, however, would be eligible for the Saver’s Match of up to $1,000. This is where the calculations become a little complicated. </w:t>
+        <w:t xml:space="preserve">Of those 54 million, another 13.3 million will be eligible for a partial Saver’s Match. </w:t>
+      </w:r>
+    </w:p>
+    <w:p>
+      <w:pPr>
+        <w:spacing w:after="240" w:before="240" w:lineRule="auto"/>
+        <w:rPr>
+          <w:sz w:val="24"/>
+          <w:szCs w:val="24"/>
+        </w:rPr>
+      </w:pPr>
+      <w:r>
+        <w:rPr>
+          <w:sz w:val="24"/>
+          <w:szCs w:val="24"/>
+          <w:rtl w:val="0"/>
+        </w:rPr>
+        <w:t xml:space="preserve">Here’s how the math works. (If the details don’t interest you, feel free to skip ahead to the next question.) </w:t>
+      </w:r>
+    </w:p>
+    <w:p>
+      <w:pPr>
+        <w:spacing w:after="240" w:before="240" w:lineRule="auto"/>
+        <w:rPr>
+          <w:sz w:val="24"/>
+          <w:szCs w:val="24"/>
+        </w:rPr>
+      </w:pPr>
+      <w:r>
+        <w:rPr>
+          <w:sz w:val="24"/>
+          <w:szCs w:val="24"/>
+          <w:rtl w:val="0"/>
+        </w:rPr>
+        <w:t xml:space="preserve">As already noted, roughly 54 million workers currently lack access to an employer-sponsored retirement plan. Conceivably, all of them will be eligible for the new retirement plans created by the Trump administration. </w:t>
+      </w:r>
+    </w:p>
+    <w:p>
+      <w:pPr>
+        <w:spacing w:after="240" w:before="240" w:lineRule="auto"/>
+        <w:rPr>
+          <w:sz w:val="24"/>
+          <w:szCs w:val="24"/>
+        </w:rPr>
+      </w:pPr>
+      <w:r>
+        <w:rPr>
+          <w:sz w:val="24"/>
+          <w:szCs w:val="24"/>
+          <w:rtl w:val="0"/>
+        </w:rPr>
+        <w:t xml:space="preserve">Not all of them, however, will be eligible for the Saver’s Match of up to $1,000. This is where the calculations become a little complicated. </w:t>
       </w:r>
     </w:p>
     <w:p>
@@ -1350,7 +1415,7 @@
         </w:rPr>
         <w:t xml:space="preserve">We can start by looking at how many workers will be eligible for the full Saver’s Match regardless of whether or not they already have access to a retirement plan. Using the Saver’s Match income thresholds and data from the </w:t>
       </w:r>
-      <w:hyperlink r:id="rId16">
+      <w:hyperlink r:id="rId14">
         <w:r>
           <w:rPr>
             <w:color w:val="1155cc"/>
@@ -1376,7 +1441,7 @@
           <w:szCs w:val="24"/>
           <w:vertAlign w:val="superscript"/>
         </w:rPr>
-        <w:footnoteReference w:customMarkFollows="0" w:id="5"/>
+        <w:footnoteReference w:customMarkFollows="0" w:id="6"/>
       </w:r>
       <w:r>
         <w:rPr>
@@ -1494,29 +1559,12 @@
           <w:szCs w:val="24"/>
           <w:vertAlign w:val="superscript"/>
         </w:rPr>
-        <w:footnoteReference w:customMarkFollows="0" w:id="6"/>
-      </w:r>
-      <w:r>
-        <w:rPr>
-          <w:rtl w:val="0"/>
-        </w:rPr>
-      </w:r>
-    </w:p>
-    <w:p>
-      <w:pPr>
-        <w:spacing w:after="240" w:before="240" w:lineRule="auto"/>
-        <w:rPr>
-          <w:sz w:val="24"/>
-          <w:szCs w:val="24"/>
-        </w:rPr>
-      </w:pPr>
-      <w:r>
-        <w:rPr>
-          <w:sz w:val="24"/>
-          <w:szCs w:val="24"/>
-          <w:rtl w:val="0"/>
-        </w:rPr>
-        <w:t xml:space="preserve">Finally, we just want to note that these estimates may change depending on the eventual details of the plan once it is formally announced by the Trump administration. </w:t>
+        <w:footnoteReference w:customMarkFollows="0" w:id="7"/>
+      </w:r>
+      <w:r>
+        <w:rPr>
+          <w:rtl w:val="0"/>
+        </w:rPr>
       </w:r>
     </w:p>
     <w:p>
@@ -1554,9 +1602,29 @@
           <w:szCs w:val="24"/>
           <w:rtl w:val="0"/>
         </w:rPr>
-        <w:t xml:space="preserve">The president noted in the State of the Union speech that half of working Americans lack access to a retirement plan with matching employer contributions, pulling directly from </w:t>
-      </w:r>
-      <w:hyperlink r:id="rId17">
+        <w:t xml:space="preserve">The president noted in the State of the Union </w:t>
+      </w:r>
+      <w:hyperlink r:id="rId15">
+        <w:r>
+          <w:rPr>
+            <w:color w:val="1155cc"/>
+            <w:sz w:val="24"/>
+            <w:szCs w:val="24"/>
+            <w:u w:val="single"/>
+            <w:rtl w:val="0"/>
+          </w:rPr>
+          <w:t xml:space="preserve">speech</w:t>
+        </w:r>
+      </w:hyperlink>
+      <w:r>
+        <w:rPr>
+          <w:sz w:val="24"/>
+          <w:szCs w:val="24"/>
+          <w:rtl w:val="0"/>
+        </w:rPr>
+        <w:t xml:space="preserve"> in February that half of working Americans lack access to a retirement plan with matching employer contributions, pulling directly from </w:t>
+      </w:r>
+      <w:hyperlink r:id="rId16">
         <w:r>
           <w:rPr>
             <w:color w:val="1155cc"/>
@@ -1649,7 +1717,7 @@
         </w:rPr>
         <w:t xml:space="preserve"> likely to induce more savings. </w:t>
       </w:r>
-      <w:hyperlink r:id="rId18">
+      <w:hyperlink r:id="rId17">
         <w:r>
           <w:rPr>
             <w:color w:val="1155cc"/>
@@ -1669,7 +1737,7 @@
         </w:rPr>
         <w:t xml:space="preserve"> shows that interest in participation rises sharply once workers understand that a match is available. We also know from the federal Thrift Savings Plan that introducing a match increased employee participation by </w:t>
       </w:r>
-      <w:hyperlink r:id="rId19">
+      <w:hyperlink r:id="rId18">
         <w:r>
           <w:rPr>
             <w:color w:val="1155cc"/>
@@ -1732,7 +1800,7 @@
         </w:rPr>
         <w:t xml:space="preserve">It has already been written! The </w:t>
       </w:r>
-      <w:hyperlink r:id="rId20">
+      <w:hyperlink r:id="rId19">
         <w:r>
           <w:rPr>
             <w:color w:val="1155cc"/>
@@ -1758,9 +1826,9 @@
           <w:szCs w:val="24"/>
           <w:rtl w:val="0"/>
         </w:rPr>
-        <w:t xml:space="preserve"> is a bipartisan piece of legislation that was built on the policy recommendations from a 2021 EIG </w:t>
-      </w:r>
-      <w:hyperlink r:id="rId21">
+        <w:t xml:space="preserve"> is a bipartisan piece of legislation that was built on the policy recommendations of a 2021 EIG </w:t>
+      </w:r>
+      <w:hyperlink r:id="rId20">
         <w:r>
           <w:rPr>
             <w:color w:val="1155cc"/>
@@ -1780,7 +1848,7 @@
         </w:rPr>
         <w:t xml:space="preserve"> by economists Teresa Ghilarducci and Kevin Hassett, who is currently President Trump’s Director of the National Economic Council. The RSAA was most recently </w:t>
       </w:r>
-      <w:hyperlink r:id="rId22">
+      <w:hyperlink r:id="rId21">
         <w:r>
           <w:rPr>
             <w:color w:val="1155cc"/>
@@ -1965,7 +2033,7 @@
         </w:rPr>
         <w:t xml:space="preserve">Differences in wealth accumulation across households are driven not only by income but by </w:t>
       </w:r>
-      <w:hyperlink r:id="rId23">
+      <w:hyperlink r:id="rId22">
         <w:r>
           <w:rPr>
             <w:color w:val="1155cc"/>
@@ -1983,7 +2051,7 @@
           <w:szCs w:val="24"/>
           <w:rtl w:val="0"/>
         </w:rPr>
-        <w:t xml:space="preserve"> and participation in asset markets. Low-income households participate in these wealth-building systems at far lower rates, and that gap compounds over time.</w:t>
+        <w:t xml:space="preserve"> and participation in asset markets like equities and housing. Low-income households participate in these wealth-building systems at far lower rates, and that gap compounds over time.</w:t>
       </w:r>
     </w:p>
     <w:p>
@@ -2027,7 +2095,7 @@
         </w:rPr>
         <w:t xml:space="preserve">every dollar of public spending on RSAA would result in roughly </w:t>
       </w:r>
-      <w:hyperlink r:id="rId24">
+      <w:hyperlink r:id="rId23">
         <w:r>
           <w:rPr>
             <w:color w:val="1155cc"/>
@@ -2064,7 +2132,7 @@
         </w:rPr>
         <w:t xml:space="preserve">Younger workers would eventually enjoy the biggest gains, as they benefit most from time and compounding. According to Brendler and Kuhn, enacting RSAA today would amount to roughly </w:t>
       </w:r>
-      <w:hyperlink r:id="rId25">
+      <w:hyperlink r:id="rId24">
         <w:r>
           <w:rPr>
             <w:color w:val="1155cc"/>
@@ -2101,7 +2169,7 @@
         </w:rPr>
         <w:t xml:space="preserve">Simulation work from </w:t>
       </w:r>
-      <w:hyperlink r:id="rId26">
+      <w:hyperlink r:id="rId25">
         <w:r>
           <w:rPr>
             <w:color w:val="1155cc"/>
@@ -2127,7 +2195,7 @@
           <w:szCs w:val="24"/>
           <w:rtl w:val="0"/>
         </w:rPr>
-        <w:t xml:space="preserve">on the effects of RSAA shows that workers in the lowest earnings tiers could accumulate roughly $126,000 in retirement savings over forty years, while a worker at the median of the earnings distribution could approach $585,000 in savings. </w:t>
+        <w:t xml:space="preserve">shows that the RSAA would “enable the lowest earners (those who consistently earn in the bottom 10 percent of the earnings distribution) to save approximately $126,000 over a 40-year working career.” A worker at the median of the earnings distribution could approach $585,000 in savings. </w:t>
       </w:r>
     </w:p>
     <w:p>
@@ -2193,7 +2261,7 @@
         </w:rPr>
         <w:t xml:space="preserve">Modeling from RAND </w:t>
       </w:r>
-      <w:hyperlink r:id="rId27">
+      <w:hyperlink r:id="rId26">
         <w:r>
           <w:rPr>
             <w:color w:val="1155cc"/>
@@ -2257,24 +2325,7 @@
           <w:szCs w:val="24"/>
           <w:rtl w:val="0"/>
         </w:rPr>
-        <w:t xml:space="preserve">The White House is likely to soon unveil the details of its new retirement plan — which, again, doesn’t require new congressional legislation. </w:t>
-      </w:r>
-    </w:p>
-    <w:p>
-      <w:pPr>
-        <w:spacing w:after="240" w:before="240" w:lineRule="auto"/>
-        <w:rPr>
-          <w:sz w:val="24"/>
-          <w:szCs w:val="24"/>
-        </w:rPr>
-      </w:pPr>
-      <w:r>
-        <w:rPr>
-          <w:sz w:val="24"/>
-          <w:szCs w:val="24"/>
-          <w:rtl w:val="0"/>
-        </w:rPr>
-        <w:t xml:space="preserve">After that, it will be up to Congress whether to enact the remaining core elements of RSAA, such as auto enrollment and expanding the match. We hope it does. Policies that are fiscally responsible, address a big lingering inequality, and offer a boost to those who need it most are rare. </w:t>
+        <w:t xml:space="preserve">It will be up to Congress whether to enact the remaining core elements of RSAA, such as auto enrollment and expanding the match. We hope it does. Policies that are fiscally responsible, address a big lingering inequality, and offer a boost to those who need it most are rare. </w:t>
       </w:r>
       <w:r>
         <w:rPr>
@@ -2286,7 +2337,7 @@
       </w:r>
     </w:p>
     <w:sectPr>
-      <w:footerReference r:id="rId28" w:type="default"/>
+      <w:footerReference r:id="rId27" w:type="default"/>
       <w:pgSz w:h="15840" w:w="12240" w:orient="portrait"/>
       <w:pgMar w:bottom="1440" w:top="1440" w:left="1440" w:right="1440" w:header="720" w:footer="720"/>
       <w:pgNumType w:start="1"/>
@@ -2297,7 +2348,7 @@
 
 <file path=word/comments.xml><?xml version="1.0" encoding="utf-8"?>
 <w:comments xmlns:mc="http://schemas.openxmlformats.org/markup-compatibility/2006" xmlns:o="urn:schemas-microsoft-com:office:office" xmlns:r="http://schemas.openxmlformats.org/officeDocument/2006/relationships" xmlns:m="http://schemas.openxmlformats.org/officeDocument/2006/math" xmlns:v="urn:schemas-microsoft-com:vml" xmlns:wp="http://schemas.openxmlformats.org/drawingml/2006/wordprocessingDrawing" xmlns:w10="urn:schemas-microsoft-com:office:word" xmlns:w="http://schemas.openxmlformats.org/wordprocessingml/2006/main" xmlns:wne="http://schemas.microsoft.com/office/word/2006/wordml" xmlns:sl="http://schemas.openxmlformats.org/schemaLibrary/2006/main" xmlns:a="http://schemas.openxmlformats.org/drawingml/2006/main" xmlns:pic="http://schemas.openxmlformats.org/drawingml/2006/picture" xmlns:c="http://schemas.openxmlformats.org/drawingml/2006/chart" xmlns:lc="http://schemas.openxmlformats.org/drawingml/2006/lockedCanvas" xmlns:dgm="http://schemas.openxmlformats.org/drawingml/2006/diagram" xmlns:wps="http://schemas.microsoft.com/office/word/2010/wordprocessingShape" xmlns:wpg="http://schemas.microsoft.com/office/word/2010/wordprocessingGroup" xmlns:w14="http://schemas.microsoft.com/office/word/2010/wordml" xmlns:w15="http://schemas.microsoft.com/office/word/2012/wordml" xmlns:w16="http://schemas.microsoft.com/office/word/2018/wordml" xmlns:w16cex="http://schemas.microsoft.com/office/word/2018/wordml/cex" xmlns:w16cid="http://schemas.microsoft.com/office/word/2016/wordml/cid" xmlns="http://schemas.microsoft.com/office/tasks/2019/documenttasks" xmlns:cr="http://schemas.microsoft.com/office/comments/2020/reactions">
-  <w:comment w:author="Cardiff Garcia" w:id="0" w:date="2026-04-21T21:54:13Z">
+  <w:comment w:author="John Lettieri" w:id="1" w:date="2026-04-23T15:13:35Z">
     <w:p>
       <w:pPr>
         <w:keepNext w:val="0"/>
@@ -2348,9 +2399,11 @@
           <w:vertAlign w:val="baseline"/>
           <w:rtl w:val="0"/>
         </w:rPr>
-        <w:t xml:space="preserve">Alt version if we publish this after the EO: "The Trump administration has just published an executive order to expand retirement plan access for private-sector workers without employer-sponsored coverage."</w:t>
-      </w:r>
-    </w:p>
+        <w:t xml:space="preserve">Need to confirm once we see EO language</w:t>
+      </w:r>
+    </w:p>
+  </w:comment>
+  <w:comment w:author="Cardiff Garcia" w:id="0" w:date="2026-04-23T15:15:04Z">
     <w:p>
       <w:pPr>
         <w:keepNext w:val="0"/>
@@ -2386,28 +2439,6 @@
       </w:pPr>
       <w:r>
         <w:rPr>
-          <w:rtl w:val="0"/>
-        </w:rPr>
-      </w:r>
-    </w:p>
-    <w:p>
-      <w:pPr>
-        <w:keepNext w:val="0"/>
-        <w:keepLines w:val="0"/>
-        <w:pageBreakBefore w:val="0"/>
-        <w:widowControl w:val="0"/>
-        <w:pBdr>
-          <w:top w:space="0" w:sz="0" w:val="nil"/>
-          <w:left w:space="0" w:sz="0" w:val="nil"/>
-          <w:bottom w:space="0" w:sz="0" w:val="nil"/>
-          <w:right w:space="0" w:sz="0" w:val="nil"/>
-          <w:between w:space="0" w:sz="0" w:val="nil"/>
-        </w:pBdr>
-        <w:shd w:fill="auto" w:val="clear"/>
-        <w:spacing w:after="0" w:before="0" w:line="240" w:lineRule="auto"/>
-        <w:ind w:left="0" w:right="0" w:firstLine="0"/>
-        <w:jc w:val="left"/>
-        <w:rPr>
           <w:rFonts w:ascii="Arial" w:cs="Arial" w:eastAsia="Arial" w:hAnsi="Arial"/>
           <w:b w:val="0"/>
           <w:bCs w:val="0"/>
@@ -2421,26 +2452,9 @@
           <w:u w:val="none"/>
           <w:shd w:fill="auto" w:val="clear"/>
           <w:vertAlign w:val="baseline"/>
-        </w:rPr>
-      </w:pPr>
-      <w:r>
-        <w:rPr>
-          <w:rFonts w:ascii="Arial" w:cs="Arial" w:eastAsia="Arial" w:hAnsi="Arial"/>
-          <w:b w:val="0"/>
-          <w:bCs w:val="0"/>
-          <w:i w:val="0"/>
-          <w:iCs w:val="0"/>
-          <w:smallCaps w:val="0"/>
-          <w:strike w:val="0"/>
-          <w:color w:val="000000"/>
-          <w:sz w:val="22"/>
-          <w:szCs w:val="22"/>
-          <w:u w:val="none"/>
-          <w:shd w:fill="auto" w:val="clear"/>
-          <w:vertAlign w:val="baseline"/>
-          <w:rtl w:val="0"/>
-        </w:rPr>
-        <w:t xml:space="preserve">And many uses of "would" will be become "will" throughout the rest of the document.</w:t>
+          <w:rtl w:val="0"/>
+        </w:rPr>
+        <w:t xml:space="preserve">Reminder to embed link</w:t>
       </w:r>
     </w:p>
   </w:comment>
@@ -2494,7 +2508,7 @@
           <w:szCs w:val="20"/>
           <w:rtl w:val="0"/>
         </w:rPr>
-        <w:t xml:space="preserve"> The CBO does not always do an explicit analysis of how tax advantaged retirement savings are broken out across the income distribution, but in 2019 we got a window into how the system works. We offer tax advantages for savings for pension plans and retirement accounts. Those tax advantages cost us money through the exclusion of collected income taxes and payroll taxes. In 2019, the CBO reported that tax expenditures from the exclusion and deferrals for contributions and earnings related to pensions and retirement plans totaled $276 billion, with $202 billion coming from income tax expenditures and $74 billion from payroll tax expenditures. </w:t>
+        <w:t xml:space="preserve"> The CBO does not always do an explicit analysis of how tax-advantaged retirement savings are broken out across the income distribution, but in 2019 we got a window into how the system works. We offer tax advantages for savings for pension plans and retirement accounts. Those tax advantages cost us money through the exclusion of collected income taxes and payroll taxes. In 2019, the CBO reported that tax expenditures from the exclusion and deferrals for contributions and earnings related to pensions and retirement plans totaled $276 billion, with $202 billion coming from income tax expenditures and $74 billion from payroll tax expenditures. </w:t>
       </w:r>
     </w:p>
   </w:footnote>
@@ -2616,7 +2630,7 @@
       </w:r>
     </w:p>
   </w:footnote>
-  <w:footnote w:id="5">
+  <w:footnote w:id="6">
     <w:p>
       <w:pPr>
         <w:spacing w:line="240" w:lineRule="auto"/>
@@ -2638,11 +2652,11 @@
           <w:szCs w:val="20"/>
           <w:rtl w:val="0"/>
         </w:rPr>
-        <w:t xml:space="preserve"> Estimates come from  the Survey of Income and Program Participation 2024 public-use file (U.S. Census Bureau), weighted to the civilian noninstitutional population. The sample restricts to individual workers age 18 and over, excludes dependents and full-time students using SIPP proxies, and includes private-sector, government, and self-employed workers. Income eligibility is tested against the 2027-projected AGI thresholds. SIPP does not report tax-return adjusted gross income directly, so we proxy AGI using annualized reference-month personal income (TPTOTINC). Married-filing-jointly filers are evaluated against spouse-pair joint income, constructed by joining each worker to their spouse via the EPNSPOUSE pointer and summing the two annualized personal-income values; workers filing Single, Head of Household, or Married Filing Separately are evaluated against personal income alone. Married-filing-jointly workers with unresolved spouse pointers fall back to personal income. A qualifying retirement account is defined as ownership of a 401(k), 403(b), Thrift Savings Plan, traditional IRA, or Keogh account; defined-benefit pensions are not qualifying accounts for the match. Counts are reported at the individual-worker level, so each adult in a married couple is counted separately.</w:t>
+        <w:t xml:space="preserve"> Estimates come from the Survey of Income and Program Participation 2024 public-use file (U.S. Census Bureau), weighted to the civilian noninstitutional population. The sample restricts to individual workers age 18 and over, excludes dependents and full-time students using SIPP proxies, and includes private-sector, government, and self-employed workers. Income eligibility is tested against the 2027-projected AGI thresholds. SIPP does not report tax-return adjusted gross income directly, so we proxy AGI using annualized reference-month personal income (TPTOTINC). Married-filing-jointly filers are evaluated against spouse-pair joint income, constructed by joining each worker to their spouse via the EPNSPOUSE pointer and summing the two annualized personal-income values; workers filing Single, Head of Household, or Married Filing Separately are evaluated against personal income alone. Married-filing-jointly workers with unresolved spouse pointers fall back to personal income. A qualifying retirement account is defined as ownership of a 401(k), 403(b), Thrift Savings Plan, traditional IRA, or Keogh account; defined-benefit pensions are not qualifying accounts for the match. Counts are reported at the individual-worker level, so each adult in a married couple is counted separately.</w:t>
       </w:r>
     </w:p>
   </w:footnote>
-  <w:footnote w:id="6">
+  <w:footnote w:id="7">
     <w:p>
       <w:pPr>
         <w:spacing w:line="240" w:lineRule="auto"/>
@@ -2730,7 +2744,7 @@
           <w:szCs w:val="20"/>
           <w:rtl w:val="0"/>
         </w:rPr>
-        <w:t xml:space="preserve">” by Duflo et al. (2006),  “</w:t>
+        <w:t xml:space="preserve">” by Duflo et al. (2006), “</w:t>
       </w:r>
       <w:hyperlink r:id="rId5">
         <w:r>
@@ -2771,6 +2785,32 @@
           <w:rtl w:val="0"/>
         </w:rPr>
         <w:t xml:space="preserve">“ by Chetty et al. (2014).</w:t>
+      </w:r>
+    </w:p>
+  </w:footnote>
+  <w:footnote w:id="5">
+    <w:p>
+      <w:pPr>
+        <w:spacing w:line="240" w:lineRule="auto"/>
+        <w:rPr>
+          <w:sz w:val="20"/>
+          <w:szCs w:val="20"/>
+        </w:rPr>
+      </w:pPr>
+      <w:r>
+        <w:rPr>
+          <w:rStyle w:val="FootnoteReference"/>
+          <w:vertAlign w:val="superscript"/>
+        </w:rPr>
+        <w:footnoteRef/>
+      </w:r>
+      <w:r>
+        <w:rPr>
+          <w:sz w:val="20"/>
+          <w:szCs w:val="20"/>
+          <w:rtl w:val="0"/>
+        </w:rPr>
+        <w:t xml:space="preserve"> Note, this estimate is likely a lower-bound as it is restricted to employed workers between the ages of 18 and 65, excluding government and self-employed workers.</w:t>
       </w:r>
     </w:p>
   </w:footnote>

</xml_diff>